<commit_message>
Add PDFs and finalize symbol table output
</commit_message>
<xml_diff>
--- a/docs/Automata Design.docx
+++ b/docs/Automata Design.docx
@@ -1910,23 +1910,7 @@
     </w:p>
     <w:p>
       <w:r>
-        <w:t>[A-</w:t>
-      </w:r>
-      <w:proofErr w:type="gramStart"/>
-      <w:r>
-        <w:t>Z][</w:t>
-      </w:r>
-      <w:proofErr w:type="gramEnd"/>
-      <w:r>
-        <w:t>a-z0-9</w:t>
-      </w:r>
-      <w:proofErr w:type="gramStart"/>
-      <w:r>
-        <w:t>_]{</w:t>
-      </w:r>
-      <w:proofErr w:type="gramEnd"/>
-      <w:r>
-        <w:t>0,30}</w:t>
+        <w:t>[A-Z][a-z0-9_]{0,30}</w:t>
       </w:r>
     </w:p>
     <w:p/>
@@ -1954,13 +1938,8 @@
     </w:p>
     <w:p>
       <w:r>
-        <w:t>[+-]?[0-</w:t>
-      </w:r>
-      <w:proofErr w:type="gramStart"/>
-      <w:r>
-        <w:t>9]+</w:t>
-      </w:r>
-      <w:proofErr w:type="gramEnd"/>
+        <w:t>[+-]?[0-9]+</w:t>
+      </w:r>
     </w:p>
     <w:p/>
     <w:p>
@@ -1987,60 +1966,7 @@
     </w:p>
     <w:p>
       <w:r>
-        <w:t>[+-]?[0-</w:t>
-      </w:r>
-      <w:proofErr w:type="gramStart"/>
-      <w:r>
-        <w:t>9]+\.[</w:t>
-      </w:r>
-      <w:proofErr w:type="gramEnd"/>
-      <w:r>
-        <w:t>0-</w:t>
-      </w:r>
-      <w:proofErr w:type="gramStart"/>
-      <w:r>
-        <w:t>9]{</w:t>
-      </w:r>
-      <w:proofErr w:type="gramEnd"/>
-      <w:r>
-        <w:t>1,</w:t>
-      </w:r>
-      <w:proofErr w:type="gramStart"/>
-      <w:r>
-        <w:t>6}(</w:t>
-      </w:r>
-      <w:proofErr w:type="gramEnd"/>
-      <w:r>
-        <w:t>[</w:t>
-      </w:r>
-      <w:proofErr w:type="spellStart"/>
-      <w:r>
-        <w:t>eE</w:t>
-      </w:r>
-      <w:proofErr w:type="spellEnd"/>
-      <w:proofErr w:type="gramStart"/>
-      <w:r>
-        <w:t>][</w:t>
-      </w:r>
-      <w:proofErr w:type="gramEnd"/>
-      <w:r>
-        <w:t>+-</w:t>
-      </w:r>
-      <w:proofErr w:type="gramStart"/>
-      <w:r>
-        <w:t>]?[</w:t>
-      </w:r>
-      <w:proofErr w:type="gramEnd"/>
-      <w:r>
-        <w:t>0-</w:t>
-      </w:r>
-      <w:proofErr w:type="gramStart"/>
-      <w:r>
-        <w:t>9]+</w:t>
-      </w:r>
-      <w:proofErr w:type="gramEnd"/>
-      <w:r>
-        <w:t>)?</w:t>
+        <w:t>[+-]?[0-9]+\.[0-9]{1,6}([eE][+-]?[0-9]+)?</w:t>
       </w:r>
     </w:p>
     <w:p/>
@@ -2068,23 +1994,7 @@
     </w:p>
     <w:p>
       <w:r>
-        <w:t>"([^"</w:t>
-      </w:r>
-      <w:proofErr w:type="gramStart"/>
-      <w:r>
-        <w:t>\n\r\\]|</w:t>
-      </w:r>
-      <w:proofErr w:type="gramEnd"/>
-      <w:r>
-        <w:t>\\["\\ntr</w:t>
-      </w:r>
-      <w:proofErr w:type="gramStart"/>
-      <w:r>
-        <w:t>])*</w:t>
-      </w:r>
-      <w:proofErr w:type="gramEnd"/>
-      <w:r>
-        <w:t>"</w:t>
+        <w:t>"([^"\n\r\\]|\\["\\ntr])*"</w:t>
       </w:r>
     </w:p>
     <w:p/>
@@ -2112,23 +2022,7 @@
     </w:p>
     <w:p>
       <w:r>
-        <w:t>'([^'</w:t>
-      </w:r>
-      <w:proofErr w:type="gramStart"/>
-      <w:r>
-        <w:t>\n\r\\]|</w:t>
-      </w:r>
-      <w:proofErr w:type="gramEnd"/>
-      <w:r>
-        <w:t>\\['\\</w:t>
-      </w:r>
-      <w:proofErr w:type="spellStart"/>
-      <w:r>
-        <w:t>ntr</w:t>
-      </w:r>
-      <w:proofErr w:type="spellEnd"/>
-      <w:r>
-        <w:t>])'</w:t>
+        <w:t>'([^'\n\r\\]|\\['\\ntr])'</w:t>
       </w:r>
     </w:p>
     <w:p/>
@@ -2156,15 +2050,7 @@
     </w:p>
     <w:p>
       <w:r>
-        <w:t>(</w:t>
-      </w:r>
-      <w:proofErr w:type="spellStart"/>
-      <w:r>
-        <w:t>true|false</w:t>
-      </w:r>
-      <w:proofErr w:type="spellEnd"/>
-      <w:r>
-        <w:t>)</w:t>
+        <w:t>(true|false)</w:t>
       </w:r>
     </w:p>
     <w:p/>
@@ -2192,28 +2078,12 @@
     </w:p>
     <w:p>
       <w:r>
-        <w:t>Arithmetic: (\*\*</w:t>
-      </w:r>
-      <w:proofErr w:type="gramStart"/>
-      <w:r>
-        <w:t>|[</w:t>
-      </w:r>
-      <w:proofErr w:type="gramEnd"/>
-      <w:r>
-        <w:t>+\-*/%])</w:t>
-      </w:r>
-    </w:p>
-    <w:p>
-      <w:r>
-        <w:t>Relational: (==</w:t>
-      </w:r>
-      <w:proofErr w:type="gramStart"/>
-      <w:r>
-        <w:t>|!=</w:t>
-      </w:r>
-      <w:proofErr w:type="gramEnd"/>
-      <w:r>
-        <w:t>|&lt;=|&gt;=|&lt;|&gt;)</w:t>
+        <w:t>Arithmetic: (\*\*|[+\-*/%])</w:t>
+      </w:r>
+    </w:p>
+    <w:p>
+      <w:r>
+        <w:t>Relational: (==|!=|&lt;=|&gt;=|&lt;|&gt;)</w:t>
       </w:r>
     </w:p>
     <w:p>
@@ -2257,15 +2127,7 @@
     </w:p>
     <w:p>
       <w:r>
-        <w:t>[</w:t>
-      </w:r>
-      <w:proofErr w:type="gramStart"/>
-      <w:r>
-        <w:t>(){}</w:t>
-      </w:r>
-      <w:proofErr w:type="gramEnd"/>
-      <w:r>
-        <w:t>\[\],;:]</w:t>
+        <w:t>[(){}\[\],;:]</w:t>
       </w:r>
     </w:p>
     <w:p/>
@@ -2292,47 +2154,13 @@
       </w:r>
     </w:p>
     <w:p>
-      <w:proofErr w:type="gramStart"/>
-      <w:r>
-        <w:t>Single-line</w:t>
-      </w:r>
-      <w:proofErr w:type="gramEnd"/>
-      <w:r>
-        <w:t>: ##[^\</w:t>
-      </w:r>
-      <w:proofErr w:type="gramStart"/>
-      <w:r>
-        <w:t>n]*</w:t>
-      </w:r>
-      <w:proofErr w:type="gramEnd"/>
-    </w:p>
-    <w:p>
-      <w:r>
-        <w:t>Multi-</w:t>
-      </w:r>
-      <w:proofErr w:type="gramStart"/>
-      <w:r>
-        <w:t>line: #</w:t>
-      </w:r>
-      <w:proofErr w:type="gramEnd"/>
-      <w:r>
-        <w:t>\*([^</w:t>
-      </w:r>
-      <w:proofErr w:type="gramStart"/>
-      <w:r>
-        <w:t>*]|</w:t>
-      </w:r>
-      <w:proofErr w:type="gramEnd"/>
-      <w:r>
-        <w:t>\*</w:t>
-      </w:r>
-      <w:proofErr w:type="gramStart"/>
-      <w:r>
-        <w:t>+[^*#])*</w:t>
-      </w:r>
-      <w:proofErr w:type="gramEnd"/>
-      <w:r>
-        <w:t>\*+#</w:t>
+      <w:r>
+        <w:t>Single-line: ##[^\n]*</w:t>
+      </w:r>
+    </w:p>
+    <w:p>
+      <w:r>
+        <w:t>Multi-line: #\*([^*]|\*+[^*#])*\*+#</w:t>
       </w:r>
     </w:p>
     <w:p/>
@@ -2360,13 +2188,8 @@
     </w:p>
     <w:p>
       <w:r>
-        <w:t xml:space="preserve">[ </w:t>
-      </w:r>
-      <w:proofErr w:type="gramStart"/>
-      <w:r>
-        <w:t>\t\r\n]+</w:t>
-      </w:r>
-      <w:proofErr w:type="gramEnd"/>
+        <w:t>[ \t\r\n]+</w:t>
+      </w:r>
     </w:p>
     <w:p/>
     <w:p>
@@ -2396,23 +2219,7 @@
     </w:p>
     <w:p>
       <w:r>
-        <w:t>3. Multi-character operators (**, ==</w:t>
-      </w:r>
-      <w:proofErr w:type="gramStart"/>
-      <w:r>
-        <w:t>, !</w:t>
-      </w:r>
-      <w:proofErr w:type="gramEnd"/>
-      <w:r>
-        <w:t>=, &lt;=, &gt;=, &amp;</w:t>
-      </w:r>
-      <w:proofErr w:type="gramStart"/>
-      <w:r>
-        <w:t>&amp;, ||</w:t>
-      </w:r>
-      <w:proofErr w:type="gramEnd"/>
-      <w:r>
-        <w:t>, ++, --, +=, -=, *=, /=)</w:t>
+        <w:t>3. Multi-character operators (**, ==, !=, &lt;=, &gt;=, &amp;&amp;, ||, ++, --, +=, -=, *=, /=)</w:t>
       </w:r>
     </w:p>
     <w:p>
@@ -2922,10 +2729,7 @@
       </w:pPr>
       <w:bookmarkStart w:id="10" w:name="_Toc221975567"/>
       <w:r>
-        <w:t>3</w:t>
-      </w:r>
-      <w:r>
-        <w:t>.1 A</w:t>
+        <w:t>3.1 A</w:t>
       </w:r>
       <w:r>
         <w:t>rithmetic</w:t>
@@ -2994,19 +2798,7 @@
       <w:bookmarkStart w:id="11" w:name="_Toc221975568"/>
       <w:r>
         <w:lastRenderedPageBreak/>
-        <w:t>3</w:t>
-      </w:r>
-      <w:r>
-        <w:t>.</w:t>
-      </w:r>
-      <w:r>
-        <w:t>2</w:t>
-      </w:r>
-      <w:r>
-        <w:t xml:space="preserve"> </w:t>
-      </w:r>
-      <w:r>
-        <w:t>Boolean</w:t>
+        <w:t>3.2 Boolean</w:t>
       </w:r>
       <w:bookmarkEnd w:id="11"/>
     </w:p>
@@ -3066,10 +2858,7 @@
       </w:pPr>
       <w:bookmarkStart w:id="12" w:name="_Toc221975569"/>
       <w:r>
-        <w:t>3</w:t>
-      </w:r>
-      <w:r>
-        <w:t>.3 Float</w:t>
+        <w:t>3.3 Float</w:t>
       </w:r>
       <w:bookmarkEnd w:id="12"/>
     </w:p>
@@ -3253,10 +3042,7 @@
       </w:pPr>
       <w:bookmarkStart w:id="15" w:name="_Toc221975572"/>
       <w:r>
-        <w:t>3</w:t>
-      </w:r>
-      <w:r>
-        <w:t>.6 Punctuator</w:t>
+        <w:t>3.6 Punctuator</w:t>
       </w:r>
       <w:bookmarkEnd w:id="15"/>
     </w:p>
@@ -3315,10 +3101,7 @@
       <w:bookmarkStart w:id="16" w:name="_Toc221975573"/>
       <w:r>
         <w:lastRenderedPageBreak/>
-        <w:t>3</w:t>
-      </w:r>
-      <w:r>
-        <w:t>.7 Single-line comment</w:t>
+        <w:t>3.7 Single-line comment</w:t>
       </w:r>
       <w:bookmarkEnd w:id="16"/>
     </w:p>

</xml_diff>

<commit_message>
Update PDFs with combined NFA and combined DFA
</commit_message>
<xml_diff>
--- a/docs/Automata Design.docx
+++ b/docs/Automata Design.docx
@@ -248,18 +248,6 @@
         <w:jc w:val="center"/>
         <w:rPr>
           <w:rFonts w:asciiTheme="majorBidi" w:eastAsia="Times New Roman" w:hAnsiTheme="majorBidi" w:cstheme="majorBidi"/>
-          <w:kern w:val="0"/>
-          <w:sz w:val="36"/>
-          <w:szCs w:val="36"/>
-          <w14:ligatures w14:val="none"/>
-        </w:rPr>
-      </w:pPr>
-    </w:p>
-    <w:p>
-      <w:pPr>
-        <w:jc w:val="center"/>
-        <w:rPr>
-          <w:rFonts w:asciiTheme="majorBidi" w:eastAsia="Times New Roman" w:hAnsiTheme="majorBidi" w:cstheme="majorBidi"/>
           <w:b/>
           <w:bCs/>
           <w:kern w:val="0"/>
@@ -332,63 +320,6 @@
     </w:p>
     <w:p>
       <w:pPr>
-        <w:tabs>
-          <w:tab w:val="left" w:pos="6420"/>
-        </w:tabs>
-        <w:autoSpaceDE w:val="0"/>
-        <w:autoSpaceDN w:val="0"/>
-        <w:adjustRightInd w:val="0"/>
-        <w:spacing w:after="0" w:line="360" w:lineRule="auto"/>
-        <w:ind w:left="567" w:right="828"/>
-        <w:jc w:val="center"/>
-        <w:rPr>
-          <w:rFonts w:asciiTheme="majorBidi" w:eastAsia="Times New Roman" w:hAnsiTheme="majorBidi" w:cstheme="majorBidi"/>
-          <w:kern w:val="0"/>
-          <w:szCs w:val="32"/>
-          <w14:ligatures w14:val="none"/>
-        </w:rPr>
-      </w:pPr>
-    </w:p>
-    <w:p>
-      <w:pPr>
-        <w:tabs>
-          <w:tab w:val="left" w:pos="6420"/>
-        </w:tabs>
-        <w:autoSpaceDE w:val="0"/>
-        <w:autoSpaceDN w:val="0"/>
-        <w:adjustRightInd w:val="0"/>
-        <w:spacing w:after="0" w:line="360" w:lineRule="auto"/>
-        <w:ind w:left="567" w:right="828"/>
-        <w:jc w:val="center"/>
-        <w:rPr>
-          <w:rFonts w:asciiTheme="majorBidi" w:eastAsia="Times New Roman" w:hAnsiTheme="majorBidi" w:cstheme="majorBidi"/>
-          <w:kern w:val="0"/>
-          <w:szCs w:val="32"/>
-          <w14:ligatures w14:val="none"/>
-        </w:rPr>
-      </w:pPr>
-    </w:p>
-    <w:p>
-      <w:pPr>
-        <w:tabs>
-          <w:tab w:val="left" w:pos="6420"/>
-        </w:tabs>
-        <w:autoSpaceDE w:val="0"/>
-        <w:autoSpaceDN w:val="0"/>
-        <w:adjustRightInd w:val="0"/>
-        <w:spacing w:after="0" w:line="360" w:lineRule="auto"/>
-        <w:ind w:left="567" w:right="828"/>
-        <w:jc w:val="center"/>
-        <w:rPr>
-          <w:rFonts w:asciiTheme="majorBidi" w:eastAsia="Times New Roman" w:hAnsiTheme="majorBidi" w:cstheme="majorBidi"/>
-          <w:kern w:val="0"/>
-          <w:szCs w:val="32"/>
-          <w14:ligatures w14:val="none"/>
-        </w:rPr>
-      </w:pPr>
-    </w:p>
-    <w:p>
-      <w:pPr>
         <w:spacing w:after="0" w:line="360" w:lineRule="auto"/>
         <w:ind w:left="567" w:right="828"/>
         <w:jc w:val="center"/>
@@ -531,64 +462,6 @@
           <w14:ligatures w14:val="none"/>
         </w:rPr>
         <w:t>2025</w:t>
-      </w:r>
-    </w:p>
-    <w:p>
-      <w:pPr>
-        <w:spacing w:after="0" w:line="360" w:lineRule="auto"/>
-        <w:ind w:left="567" w:right="828"/>
-        <w:jc w:val="center"/>
-        <w:rPr>
-          <w:rFonts w:asciiTheme="majorBidi" w:eastAsia="Times New Roman" w:hAnsiTheme="majorBidi" w:cstheme="majorBidi"/>
-          <w:kern w:val="0"/>
-          <w:sz w:val="40"/>
-          <w:szCs w:val="40"/>
-          <w14:ligatures w14:val="none"/>
-        </w:rPr>
-      </w:pPr>
-      <w:r>
-        <w:rPr>
-          <w:rFonts w:asciiTheme="majorBidi" w:eastAsia="Times New Roman" w:hAnsiTheme="majorBidi" w:cstheme="majorBidi"/>
-          <w:kern w:val="0"/>
-          <w:sz w:val="40"/>
-          <w:szCs w:val="40"/>
-          <w14:ligatures w14:val="none"/>
-        </w:rPr>
-        <w:t>Lecturer</w:t>
-      </w:r>
-    </w:p>
-    <w:p>
-      <w:pPr>
-        <w:spacing w:after="0" w:line="360" w:lineRule="auto"/>
-        <w:ind w:left="567" w:right="828"/>
-        <w:jc w:val="center"/>
-        <w:rPr>
-          <w:rFonts w:asciiTheme="majorBidi" w:eastAsia="Times New Roman" w:hAnsiTheme="majorBidi" w:cstheme="majorBidi"/>
-          <w:kern w:val="0"/>
-          <w:sz w:val="40"/>
-          <w:szCs w:val="40"/>
-          <w14:ligatures w14:val="none"/>
-        </w:rPr>
-      </w:pPr>
-      <w:r>
-        <w:rPr>
-          <w:rFonts w:asciiTheme="majorBidi" w:eastAsia="Times New Roman" w:hAnsiTheme="majorBidi" w:cstheme="majorBidi"/>
-          <w:kern w:val="0"/>
-          <w:sz w:val="40"/>
-          <w:szCs w:val="40"/>
-          <w14:ligatures w14:val="none"/>
-        </w:rPr>
-        <w:t>Dr</w:t>
-      </w:r>
-      <w:r>
-        <w:rPr>
-          <w:rFonts w:asciiTheme="majorBidi" w:eastAsia="Times New Roman" w:hAnsiTheme="majorBidi" w:cstheme="majorBidi"/>
-          <w:kern w:val="0"/>
-          <w:sz w:val="40"/>
-          <w:szCs w:val="40"/>
-          <w14:ligatures w14:val="none"/>
-        </w:rPr>
-        <w:t xml:space="preserve"> Mahreen Alam</w:t>
       </w:r>
     </w:p>
     <w:p>
@@ -766,7 +639,7 @@
                 <w:noProof/>
                 <w:webHidden/>
               </w:rPr>
-              <w:t>5</w:t>
+              <w:t>6</w:t>
             </w:r>
             <w:r>
               <w:rPr>
@@ -834,7 +707,7 @@
                 <w:noProof/>
                 <w:webHidden/>
               </w:rPr>
-              <w:t>5</w:t>
+              <w:t>6</w:t>
             </w:r>
             <w:r>
               <w:rPr>
@@ -902,7 +775,7 @@
                 <w:noProof/>
                 <w:webHidden/>
               </w:rPr>
-              <w:t>5</w:t>
+              <w:t>6</w:t>
             </w:r>
             <w:r>
               <w:rPr>
@@ -970,7 +843,7 @@
                 <w:noProof/>
                 <w:webHidden/>
               </w:rPr>
-              <w:t>5</w:t>
+              <w:t>7</w:t>
             </w:r>
             <w:r>
               <w:rPr>
@@ -1038,7 +911,7 @@
                 <w:noProof/>
                 <w:webHidden/>
               </w:rPr>
-              <w:t>5</w:t>
+              <w:t>7</w:t>
             </w:r>
             <w:r>
               <w:rPr>
@@ -1106,7 +979,7 @@
                 <w:noProof/>
                 <w:webHidden/>
               </w:rPr>
-              <w:t>6</w:t>
+              <w:t>7</w:t>
             </w:r>
             <w:r>
               <w:rPr>
@@ -1174,7 +1047,7 @@
                 <w:noProof/>
                 <w:webHidden/>
               </w:rPr>
-              <w:t>6</w:t>
+              <w:t>7</w:t>
             </w:r>
             <w:r>
               <w:rPr>
@@ -1242,7 +1115,7 @@
                 <w:noProof/>
                 <w:webHidden/>
               </w:rPr>
-              <w:t>6</w:t>
+              <w:t>8</w:t>
             </w:r>
             <w:r>
               <w:rPr>
@@ -1310,7 +1183,7 @@
                 <w:noProof/>
                 <w:webHidden/>
               </w:rPr>
-              <w:t>6</w:t>
+              <w:t>9</w:t>
             </w:r>
             <w:r>
               <w:rPr>
@@ -1378,7 +1251,7 @@
                 <w:noProof/>
                 <w:webHidden/>
               </w:rPr>
-              <w:t>6</w:t>
+              <w:t>9</w:t>
             </w:r>
             <w:r>
               <w:rPr>
@@ -1446,7 +1319,7 @@
                 <w:noProof/>
                 <w:webHidden/>
               </w:rPr>
-              <w:t>7</w:t>
+              <w:t>9</w:t>
             </w:r>
             <w:r>
               <w:rPr>
@@ -1514,7 +1387,7 @@
                 <w:noProof/>
                 <w:webHidden/>
               </w:rPr>
-              <w:t>7</w:t>
+              <w:t>10</w:t>
             </w:r>
             <w:r>
               <w:rPr>
@@ -1582,7 +1455,7 @@
                 <w:noProof/>
                 <w:webHidden/>
               </w:rPr>
-              <w:t>8</w:t>
+              <w:t>11</w:t>
             </w:r>
             <w:r>
               <w:rPr>
@@ -1650,7 +1523,7 @@
                 <w:noProof/>
                 <w:webHidden/>
               </w:rPr>
-              <w:t>8</w:t>
+              <w:t>11</w:t>
             </w:r>
             <w:r>
               <w:rPr>
@@ -1718,7 +1591,7 @@
                 <w:noProof/>
                 <w:webHidden/>
               </w:rPr>
-              <w:t>8</w:t>
+              <w:t>12</w:t>
             </w:r>
             <w:r>
               <w:rPr>
@@ -1786,7 +1659,7 @@
                 <w:noProof/>
                 <w:webHidden/>
               </w:rPr>
-              <w:t>9</w:t>
+              <w:t>12</w:t>
             </w:r>
             <w:r>
               <w:rPr>
@@ -2050,6 +1923,7 @@
     </w:p>
     <w:p>
       <w:r>
+        <w:lastRenderedPageBreak/>
         <w:t>(true|false)</w:t>
       </w:r>
     </w:p>
@@ -2098,7 +1972,6 @@
     </w:p>
     <w:p>
       <w:r>
-        <w:lastRenderedPageBreak/>
         <w:t>Inc/Dec: (\+\+|--)</w:t>
       </w:r>
     </w:p>
@@ -2214,6 +2087,7 @@
     </w:p>
     <w:p>
       <w:r>
+        <w:lastRenderedPageBreak/>
         <w:t>2. Single-line comments</w:t>
       </w:r>
     </w:p>
@@ -2421,6 +2295,7 @@
       </w:pPr>
       <w:bookmarkStart w:id="4" w:name="_Toc221975561"/>
       <w:r>
+        <w:lastRenderedPageBreak/>
         <w:t>2.3 Float</w:t>
       </w:r>
       <w:bookmarkEnd w:id="4"/>
@@ -2431,8 +2306,8 @@
           <w:noProof/>
         </w:rPr>
         <w:drawing>
-          <wp:inline distT="0" distB="0" distL="0" distR="0" wp14:anchorId="6F5B867F" wp14:editId="671C2C2A">
-            <wp:extent cx="6858000" cy="1318895"/>
+          <wp:inline distT="0" distB="0" distL="0" distR="0" wp14:anchorId="6F5B867F" wp14:editId="7DB8271E">
+            <wp:extent cx="9757048" cy="1876425"/>
             <wp:effectExtent l="0" t="0" r="0" b="0"/>
             <wp:docPr id="1933686404" name="Graphic 3"/>
             <wp:cNvGraphicFramePr>
@@ -2460,7 +2335,7 @@
                   <pic:spPr>
                     <a:xfrm>
                       <a:off x="0" y="0"/>
-                      <a:ext cx="6858000" cy="1318895"/>
+                      <a:ext cx="9762066" cy="1877390"/>
                     </a:xfrm>
                     <a:prstGeom prst="rect">
                       <a:avLst/>
@@ -2483,6 +2358,9 @@
         <w:t>2.4 ID</w:t>
       </w:r>
       <w:bookmarkEnd w:id="5"/>
+      <w:r>
+        <w:t xml:space="preserve"> (broken in two halves due to space constraint)</w:t>
+      </w:r>
     </w:p>
     <w:p>
       <w:r>
@@ -2490,9 +2368,64 @@
           <w:noProof/>
         </w:rPr>
         <w:drawing>
-          <wp:inline distT="0" distB="0" distL="0" distR="0" wp14:anchorId="06EDCD6E" wp14:editId="25F38CB2">
-            <wp:extent cx="6858000" cy="106680"/>
-            <wp:effectExtent l="0" t="0" r="0" b="7620"/>
+          <wp:inline distT="0" distB="0" distL="0" distR="0" wp14:anchorId="688FCBB9" wp14:editId="5BAC5467">
+            <wp:extent cx="9315126" cy="249382"/>
+            <wp:effectExtent l="0" t="0" r="0" b="0"/>
+            <wp:docPr id="1399762206" name="Graphic 4"/>
+            <wp:cNvGraphicFramePr>
+              <a:graphicFrameLocks xmlns:a="http://schemas.openxmlformats.org/drawingml/2006/main" noChangeAspect="1"/>
+            </wp:cNvGraphicFramePr>
+            <a:graphic xmlns:a="http://schemas.openxmlformats.org/drawingml/2006/main">
+              <a:graphicData uri="http://schemas.openxmlformats.org/drawingml/2006/picture">
+                <pic:pic xmlns:pic="http://schemas.openxmlformats.org/drawingml/2006/picture">
+                  <pic:nvPicPr>
+                    <pic:cNvPr id="273450481" name="Graphic 273450481"/>
+                    <pic:cNvPicPr/>
+                  </pic:nvPicPr>
+                  <pic:blipFill rotWithShape="1">
+                    <a:blip r:embed="rId13">
+                      <a:extLst>
+                        <a:ext uri="{96DAC541-7B7A-43D3-8B79-37D633B846F1}">
+                          <asvg:svgBlip xmlns:asvg="http://schemas.microsoft.com/office/drawing/2016/SVG/main" r:embed="rId14"/>
+                        </a:ext>
+                      </a:extLst>
+                    </a:blip>
+                    <a:srcRect t="1" r="54912" b="22403"/>
+                    <a:stretch>
+                      <a:fillRect/>
+                    </a:stretch>
+                  </pic:blipFill>
+                  <pic:spPr bwMode="auto">
+                    <a:xfrm>
+                      <a:off x="0" y="0"/>
+                      <a:ext cx="9554590" cy="255793"/>
+                    </a:xfrm>
+                    <a:prstGeom prst="rect">
+                      <a:avLst/>
+                    </a:prstGeom>
+                    <a:ln>
+                      <a:noFill/>
+                    </a:ln>
+                    <a:extLst>
+                      <a:ext uri="{53640926-AAD7-44D8-BBD7-CCE9431645EC}">
+                        <a14:shadowObscured xmlns:a14="http://schemas.microsoft.com/office/drawing/2010/main"/>
+                      </a:ext>
+                    </a:extLst>
+                  </pic:spPr>
+                </pic:pic>
+              </a:graphicData>
+            </a:graphic>
+          </wp:inline>
+        </w:drawing>
+      </w:r>
+      <w:r>
+        <w:rPr>
+          <w:noProof/>
+        </w:rPr>
+        <w:drawing>
+          <wp:inline distT="0" distB="0" distL="0" distR="0" wp14:anchorId="06EDCD6E" wp14:editId="0B1E8603">
+            <wp:extent cx="9846374" cy="270164"/>
+            <wp:effectExtent l="0" t="0" r="0" b="0"/>
             <wp:docPr id="273450481" name="Graphic 4"/>
             <wp:cNvGraphicFramePr>
               <a:graphicFrameLocks xmlns:a="http://schemas.openxmlformats.org/drawingml/2006/main" noChangeAspect="1"/>
@@ -2504,7 +2437,7 @@
                     <pic:cNvPr id="273450481" name="Graphic 273450481"/>
                     <pic:cNvPicPr/>
                   </pic:nvPicPr>
-                  <pic:blipFill>
+                  <pic:blipFill rotWithShape="1">
                     <a:blip r:embed="rId13">
                       <a:extLst>
                         <a:ext uri="{96DAC541-7B7A-43D3-8B79-37D633B846F1}">
@@ -2512,18 +2445,27 @@
                         </a:ext>
                       </a:extLst>
                     </a:blip>
+                    <a:srcRect l="43307" t="2" b="-2"/>
                     <a:stretch>
                       <a:fillRect/>
                     </a:stretch>
                   </pic:blipFill>
-                  <pic:spPr>
+                  <pic:spPr bwMode="auto">
                     <a:xfrm>
                       <a:off x="0" y="0"/>
-                      <a:ext cx="6858000" cy="106680"/>
+                      <a:ext cx="10739562" cy="294671"/>
                     </a:xfrm>
                     <a:prstGeom prst="rect">
                       <a:avLst/>
                     </a:prstGeom>
+                    <a:ln>
+                      <a:noFill/>
+                    </a:ln>
+                    <a:extLst>
+                      <a:ext uri="{53640926-AAD7-44D8-BBD7-CCE9431645EC}">
+                        <a14:shadowObscured xmlns:a14="http://schemas.microsoft.com/office/drawing/2010/main"/>
+                      </a:ext>
+                    </a:extLst>
                   </pic:spPr>
                 </pic:pic>
               </a:graphicData>
@@ -2539,7 +2481,6 @@
       </w:pPr>
       <w:bookmarkStart w:id="6" w:name="_Toc221975563"/>
       <w:r>
-        <w:lastRenderedPageBreak/>
         <w:t>2.5 Integer</w:t>
       </w:r>
       <w:bookmarkEnd w:id="6"/>
@@ -2599,6 +2540,7 @@
       </w:pPr>
       <w:bookmarkStart w:id="7" w:name="_Toc221975564"/>
       <w:r>
+        <w:lastRenderedPageBreak/>
         <w:t>2.6 Punctuator</w:t>
       </w:r>
       <w:bookmarkEnd w:id="7"/>
@@ -2710,48 +2652,34 @@
         </w:drawing>
       </w:r>
     </w:p>
-    <w:p>
-      <w:pPr>
-        <w:pStyle w:val="Heading1"/>
-      </w:pPr>
-      <w:bookmarkStart w:id="9" w:name="_Toc221975566"/>
-      <w:r>
-        <w:t xml:space="preserve">3. </w:t>
-      </w:r>
-      <w:r>
-        <w:t>DFA</w:t>
-      </w:r>
-      <w:bookmarkEnd w:id="9"/>
-    </w:p>
+    <w:p/>
     <w:p>
       <w:pPr>
         <w:pStyle w:val="Heading2"/>
       </w:pPr>
-      <w:bookmarkStart w:id="10" w:name="_Toc221975567"/>
-      <w:r>
-        <w:t>3.1 A</w:t>
-      </w:r>
-      <w:r>
-        <w:t>rithmetic</w:t>
-      </w:r>
-      <w:r>
-        <w:t xml:space="preserve"> </w:t>
-      </w:r>
-      <w:r>
-        <w:t>operators</w:t>
-      </w:r>
-      <w:bookmarkEnd w:id="10"/>
-    </w:p>
-    <w:p>
-      <w:r>
-        <w:rPr>
-          <w:noProof/>
-        </w:rPr>
+      <w:r>
+        <w:lastRenderedPageBreak/>
         <w:drawing>
-          <wp:inline distT="0" distB="0" distL="0" distR="0" wp14:anchorId="1D972EF1" wp14:editId="208D9A0E">
-            <wp:extent cx="4800600" cy="2320149"/>
-            <wp:effectExtent l="0" t="0" r="0" b="4445"/>
-            <wp:docPr id="1355520723" name="Graphic 8"/>
+          <wp:anchor distT="0" distB="0" distL="114300" distR="114300" simplePos="0" relativeHeight="251660288" behindDoc="1" locked="0" layoutInCell="1" allowOverlap="1" wp14:anchorId="50A7F45A" wp14:editId="1A0A93C2">
+            <wp:simplePos x="0" y="0"/>
+            <wp:positionH relativeFrom="page">
+              <wp:align>left</wp:align>
+            </wp:positionH>
+            <wp:positionV relativeFrom="paragraph">
+              <wp:posOffset>335280</wp:posOffset>
+            </wp:positionV>
+            <wp:extent cx="9919335" cy="4849495"/>
+            <wp:effectExtent l="0" t="0" r="5715" b="8255"/>
+            <wp:wrapTight wrapText="bothSides">
+              <wp:wrapPolygon edited="0">
+                <wp:start x="0" y="0"/>
+                <wp:lineTo x="0" y="21552"/>
+                <wp:lineTo x="21571" y="21552"/>
+                <wp:lineTo x="21571" y="0"/>
+                <wp:lineTo x="0" y="0"/>
+              </wp:wrapPolygon>
+            </wp:wrapTight>
+            <wp:docPr id="2043565277" name="Graphic 1"/>
             <wp:cNvGraphicFramePr>
               <a:graphicFrameLocks xmlns:a="http://schemas.openxmlformats.org/drawingml/2006/main" noChangeAspect="1"/>
             </wp:cNvGraphicFramePr>
@@ -2759,7 +2687,7 @@
               <a:graphicData uri="http://schemas.openxmlformats.org/drawingml/2006/picture">
                 <pic:pic xmlns:pic="http://schemas.openxmlformats.org/drawingml/2006/picture">
                   <pic:nvPicPr>
-                    <pic:cNvPr id="1355520723" name="Graphic 1355520723"/>
+                    <pic:cNvPr id="2043565277" name=""/>
                     <pic:cNvPicPr/>
                   </pic:nvPicPr>
                   <pic:blipFill>
@@ -2777,7 +2705,7 @@
                   <pic:spPr>
                     <a:xfrm>
                       <a:off x="0" y="0"/>
-                      <a:ext cx="4804961" cy="2322256"/>
+                      <a:ext cx="9933898" cy="4856846"/>
                     </a:xfrm>
                     <a:prstGeom prst="rect">
                       <a:avLst/>
@@ -2786,33 +2714,64 @@
                 </pic:pic>
               </a:graphicData>
             </a:graphic>
-          </wp:inline>
+            <wp14:sizeRelH relativeFrom="margin">
+              <wp14:pctWidth>0</wp14:pctWidth>
+            </wp14:sizeRelH>
+            <wp14:sizeRelV relativeFrom="margin">
+              <wp14:pctHeight>0</wp14:pctHeight>
+            </wp14:sizeRelV>
+          </wp:anchor>
         </w:drawing>
       </w:r>
+      <w:r>
+        <w:t>2.8 Combined NFA</w:t>
+      </w:r>
     </w:p>
     <w:p/>
+    <w:p/>
+    <w:p>
+      <w:pPr>
+        <w:pStyle w:val="Heading1"/>
+      </w:pPr>
+      <w:bookmarkStart w:id="9" w:name="_Toc221975566"/>
+      <w:r>
+        <w:lastRenderedPageBreak/>
+        <w:t xml:space="preserve">3. </w:t>
+      </w:r>
+      <w:r>
+        <w:t>DFA</w:t>
+      </w:r>
+      <w:bookmarkEnd w:id="9"/>
+    </w:p>
     <w:p>
       <w:pPr>
         <w:pStyle w:val="Heading2"/>
       </w:pPr>
-      <w:bookmarkStart w:id="11" w:name="_Toc221975568"/>
-      <w:r>
-        <w:lastRenderedPageBreak/>
-        <w:t>3.2 Boolean</w:t>
-      </w:r>
-      <w:bookmarkEnd w:id="11"/>
-    </w:p>
-    <w:p/>
+      <w:bookmarkStart w:id="10" w:name="_Toc221975567"/>
+      <w:r>
+        <w:t>3.1 A</w:t>
+      </w:r>
+      <w:r>
+        <w:t>rithmetic</w:t>
+      </w:r>
+      <w:r>
+        <w:t xml:space="preserve"> </w:t>
+      </w:r>
+      <w:r>
+        <w:t>operators</w:t>
+      </w:r>
+      <w:bookmarkEnd w:id="10"/>
+    </w:p>
     <w:p>
       <w:r>
         <w:rPr>
           <w:noProof/>
         </w:rPr>
         <w:drawing>
-          <wp:inline distT="0" distB="0" distL="0" distR="0" wp14:anchorId="3364F8DF" wp14:editId="17B2C7C6">
-            <wp:extent cx="6858000" cy="4458970"/>
-            <wp:effectExtent l="0" t="0" r="0" b="0"/>
-            <wp:docPr id="1524115882" name="Graphic 9"/>
+          <wp:inline distT="0" distB="0" distL="0" distR="0" wp14:anchorId="1D972EF1" wp14:editId="54EDE77C">
+            <wp:extent cx="3920836" cy="1894955"/>
+            <wp:effectExtent l="0" t="0" r="3810" b="0"/>
+            <wp:docPr id="1355520723" name="Graphic 8"/>
             <wp:cNvGraphicFramePr>
               <a:graphicFrameLocks xmlns:a="http://schemas.openxmlformats.org/drawingml/2006/main" noChangeAspect="1"/>
             </wp:cNvGraphicFramePr>
@@ -2820,7 +2779,7 @@
               <a:graphicData uri="http://schemas.openxmlformats.org/drawingml/2006/picture">
                 <pic:pic xmlns:pic="http://schemas.openxmlformats.org/drawingml/2006/picture">
                   <pic:nvPicPr>
-                    <pic:cNvPr id="1524115882" name="Graphic 1524115882"/>
+                    <pic:cNvPr id="1355520723" name="Graphic 1355520723"/>
                     <pic:cNvPicPr/>
                   </pic:nvPicPr>
                   <pic:blipFill>
@@ -2838,7 +2797,7 @@
                   <pic:spPr>
                     <a:xfrm>
                       <a:off x="0" y="0"/>
-                      <a:ext cx="6858000" cy="4458970"/>
+                      <a:ext cx="3929976" cy="1899372"/>
                     </a:xfrm>
                     <a:prstGeom prst="rect">
                       <a:avLst/>
@@ -2851,27 +2810,27 @@
         </w:drawing>
       </w:r>
     </w:p>
+    <w:p>
+      <w:pPr>
+        <w:pStyle w:val="Heading2"/>
+      </w:pPr>
+      <w:bookmarkStart w:id="11" w:name="_Toc221975568"/>
+      <w:r>
+        <w:t>3.2 Boolean</w:t>
+      </w:r>
+      <w:bookmarkEnd w:id="11"/>
+    </w:p>
     <w:p/>
-    <w:p>
-      <w:pPr>
-        <w:pStyle w:val="Heading2"/>
-      </w:pPr>
-      <w:bookmarkStart w:id="12" w:name="_Toc221975569"/>
-      <w:r>
-        <w:t>3.3 Float</w:t>
-      </w:r>
-      <w:bookmarkEnd w:id="12"/>
-    </w:p>
     <w:p>
       <w:r>
         <w:rPr>
           <w:noProof/>
         </w:rPr>
         <w:drawing>
-          <wp:inline distT="0" distB="0" distL="0" distR="0" wp14:anchorId="68BC777D" wp14:editId="40A6B319">
-            <wp:extent cx="6858000" cy="1264920"/>
-            <wp:effectExtent l="0" t="0" r="0" b="0"/>
-            <wp:docPr id="333281715" name="Graphic 10"/>
+          <wp:inline distT="0" distB="0" distL="0" distR="0" wp14:anchorId="3364F8DF" wp14:editId="275C38DD">
+            <wp:extent cx="4793673" cy="3116775"/>
+            <wp:effectExtent l="0" t="0" r="6985" b="7620"/>
+            <wp:docPr id="1524115882" name="Graphic 9"/>
             <wp:cNvGraphicFramePr>
               <a:graphicFrameLocks xmlns:a="http://schemas.openxmlformats.org/drawingml/2006/main" noChangeAspect="1"/>
             </wp:cNvGraphicFramePr>
@@ -2879,7 +2838,7 @@
               <a:graphicData uri="http://schemas.openxmlformats.org/drawingml/2006/picture">
                 <pic:pic xmlns:pic="http://schemas.openxmlformats.org/drawingml/2006/picture">
                   <pic:nvPicPr>
-                    <pic:cNvPr id="333281715" name="Graphic 333281715"/>
+                    <pic:cNvPr id="1524115882" name="Graphic 1524115882"/>
                     <pic:cNvPicPr/>
                   </pic:nvPicPr>
                   <pic:blipFill>
@@ -2897,7 +2856,7 @@
                   <pic:spPr>
                     <a:xfrm>
                       <a:off x="0" y="0"/>
-                      <a:ext cx="6858000" cy="1264920"/>
+                      <a:ext cx="4815914" cy="3131236"/>
                     </a:xfrm>
                     <a:prstGeom prst="rect">
                       <a:avLst/>
@@ -2915,15 +2874,11 @@
       <w:pPr>
         <w:pStyle w:val="Heading2"/>
       </w:pPr>
-      <w:bookmarkStart w:id="13" w:name="_Toc221975570"/>
-      <w:r>
-        <w:lastRenderedPageBreak/>
-        <w:t>3</w:t>
-      </w:r>
-      <w:r>
-        <w:t>.4 ID</w:t>
-      </w:r>
-      <w:bookmarkEnd w:id="13"/>
+      <w:bookmarkStart w:id="12" w:name="_Toc221975569"/>
+      <w:r>
+        <w:t>3.3 Float</w:t>
+      </w:r>
+      <w:bookmarkEnd w:id="12"/>
     </w:p>
     <w:p>
       <w:r>
@@ -2931,10 +2886,10 @@
           <w:noProof/>
         </w:rPr>
         <w:drawing>
-          <wp:inline distT="0" distB="0" distL="0" distR="0" wp14:anchorId="7849515B" wp14:editId="47FF1BD9">
-            <wp:extent cx="6858000" cy="2150745"/>
-            <wp:effectExtent l="0" t="0" r="0" b="1905"/>
-            <wp:docPr id="1532140339" name="Graphic 11"/>
+          <wp:inline distT="0" distB="0" distL="0" distR="0" wp14:anchorId="68BC777D" wp14:editId="25326C66">
+            <wp:extent cx="9689834" cy="1787236"/>
+            <wp:effectExtent l="0" t="0" r="6985" b="3810"/>
+            <wp:docPr id="333281715" name="Graphic 10"/>
             <wp:cNvGraphicFramePr>
               <a:graphicFrameLocks xmlns:a="http://schemas.openxmlformats.org/drawingml/2006/main" noChangeAspect="1"/>
             </wp:cNvGraphicFramePr>
@@ -2942,7 +2897,7 @@
               <a:graphicData uri="http://schemas.openxmlformats.org/drawingml/2006/picture">
                 <pic:pic xmlns:pic="http://schemas.openxmlformats.org/drawingml/2006/picture">
                   <pic:nvPicPr>
-                    <pic:cNvPr id="1532140339" name="Graphic 1532140339"/>
+                    <pic:cNvPr id="333281715" name="Graphic 333281715"/>
                     <pic:cNvPicPr/>
                   </pic:nvPicPr>
                   <pic:blipFill>
@@ -2960,7 +2915,7 @@
                   <pic:spPr>
                     <a:xfrm>
                       <a:off x="0" y="0"/>
-                      <a:ext cx="6858000" cy="2150745"/>
+                      <a:ext cx="9709551" cy="1790873"/>
                     </a:xfrm>
                     <a:prstGeom prst="rect">
                       <a:avLst/>
@@ -2978,14 +2933,14 @@
       <w:pPr>
         <w:pStyle w:val="Heading2"/>
       </w:pPr>
-      <w:bookmarkStart w:id="14" w:name="_Toc221975571"/>
+      <w:bookmarkStart w:id="13" w:name="_Toc221975570"/>
       <w:r>
         <w:t>3</w:t>
       </w:r>
       <w:r>
-        <w:t>.5 Integer</w:t>
-      </w:r>
-      <w:bookmarkEnd w:id="14"/>
+        <w:t>.4 ID</w:t>
+      </w:r>
+      <w:bookmarkEnd w:id="13"/>
     </w:p>
     <w:p>
       <w:r>
@@ -2993,10 +2948,10 @@
           <w:noProof/>
         </w:rPr>
         <w:drawing>
-          <wp:inline distT="0" distB="0" distL="0" distR="0" wp14:anchorId="13695642" wp14:editId="51849772">
-            <wp:extent cx="5573487" cy="1915886"/>
-            <wp:effectExtent l="0" t="0" r="8255" b="8255"/>
-            <wp:docPr id="1700204307" name="Graphic 12"/>
+          <wp:inline distT="0" distB="0" distL="0" distR="0" wp14:anchorId="7849515B" wp14:editId="3C66AF26">
+            <wp:extent cx="10132110" cy="3177542"/>
+            <wp:effectExtent l="0" t="0" r="2540" b="3810"/>
+            <wp:docPr id="1532140339" name="Graphic 11"/>
             <wp:cNvGraphicFramePr>
               <a:graphicFrameLocks xmlns:a="http://schemas.openxmlformats.org/drawingml/2006/main" noChangeAspect="1"/>
             </wp:cNvGraphicFramePr>
@@ -3004,7 +2959,7 @@
               <a:graphicData uri="http://schemas.openxmlformats.org/drawingml/2006/picture">
                 <pic:pic xmlns:pic="http://schemas.openxmlformats.org/drawingml/2006/picture">
                   <pic:nvPicPr>
-                    <pic:cNvPr id="1700204307" name="Graphic 1700204307"/>
+                    <pic:cNvPr id="1532140339" name="Graphic 1532140339"/>
                     <pic:cNvPicPr/>
                   </pic:nvPicPr>
                   <pic:blipFill>
@@ -3022,7 +2977,7 @@
                   <pic:spPr>
                     <a:xfrm>
                       <a:off x="0" y="0"/>
-                      <a:ext cx="5574540" cy="1916248"/>
+                      <a:ext cx="10132110" cy="3177542"/>
                     </a:xfrm>
                     <a:prstGeom prst="rect">
                       <a:avLst/>
@@ -3035,16 +2990,19 @@
         </w:drawing>
       </w:r>
     </w:p>
-    <w:p/>
     <w:p>
       <w:pPr>
         <w:pStyle w:val="Heading2"/>
       </w:pPr>
-      <w:bookmarkStart w:id="15" w:name="_Toc221975572"/>
-      <w:r>
-        <w:t>3.6 Punctuator</w:t>
-      </w:r>
-      <w:bookmarkEnd w:id="15"/>
+      <w:bookmarkStart w:id="14" w:name="_Toc221975571"/>
+      <w:r>
+        <w:lastRenderedPageBreak/>
+        <w:t>3</w:t>
+      </w:r>
+      <w:r>
+        <w:t>.5 Integer</w:t>
+      </w:r>
+      <w:bookmarkEnd w:id="14"/>
     </w:p>
     <w:p>
       <w:r>
@@ -3052,10 +3010,10 @@
           <w:noProof/>
         </w:rPr>
         <w:drawing>
-          <wp:inline distT="0" distB="0" distL="0" distR="0" wp14:anchorId="15A45230" wp14:editId="6F433AD7">
-            <wp:extent cx="3957468" cy="1153886"/>
-            <wp:effectExtent l="0" t="0" r="5080" b="8255"/>
-            <wp:docPr id="1452460361" name="Graphic 13"/>
+          <wp:inline distT="0" distB="0" distL="0" distR="0" wp14:anchorId="13695642" wp14:editId="223DC6B2">
+            <wp:extent cx="5105400" cy="1754981"/>
+            <wp:effectExtent l="0" t="0" r="0" b="0"/>
+            <wp:docPr id="1700204307" name="Graphic 12"/>
             <wp:cNvGraphicFramePr>
               <a:graphicFrameLocks xmlns:a="http://schemas.openxmlformats.org/drawingml/2006/main" noChangeAspect="1"/>
             </wp:cNvGraphicFramePr>
@@ -3063,7 +3021,7 @@
               <a:graphicData uri="http://schemas.openxmlformats.org/drawingml/2006/picture">
                 <pic:pic xmlns:pic="http://schemas.openxmlformats.org/drawingml/2006/picture">
                   <pic:nvPicPr>
-                    <pic:cNvPr id="1452460361" name="Graphic 1452460361"/>
+                    <pic:cNvPr id="1700204307" name="Graphic 1700204307"/>
                     <pic:cNvPicPr/>
                   </pic:nvPicPr>
                   <pic:blipFill>
@@ -3081,7 +3039,7 @@
                   <pic:spPr>
                     <a:xfrm>
                       <a:off x="0" y="0"/>
-                      <a:ext cx="3971298" cy="1157918"/>
+                      <a:ext cx="5113650" cy="1757817"/>
                     </a:xfrm>
                     <a:prstGeom prst="rect">
                       <a:avLst/>
@@ -3098,12 +3056,11 @@
       <w:pPr>
         <w:pStyle w:val="Heading2"/>
       </w:pPr>
-      <w:bookmarkStart w:id="16" w:name="_Toc221975573"/>
-      <w:r>
-        <w:lastRenderedPageBreak/>
-        <w:t>3.7 Single-line comment</w:t>
-      </w:r>
-      <w:bookmarkEnd w:id="16"/>
+      <w:bookmarkStart w:id="15" w:name="_Toc221975572"/>
+      <w:r>
+        <w:t>3.6 Punctuator</w:t>
+      </w:r>
+      <w:bookmarkEnd w:id="15"/>
     </w:p>
     <w:p>
       <w:r>
@@ -3111,10 +3068,10 @@
           <w:noProof/>
         </w:rPr>
         <w:drawing>
-          <wp:inline distT="0" distB="0" distL="0" distR="0" wp14:anchorId="73CE4788" wp14:editId="25D2686F">
-            <wp:extent cx="5514975" cy="2247900"/>
-            <wp:effectExtent l="0" t="0" r="9525" b="0"/>
-            <wp:docPr id="1061379370" name="Graphic 14"/>
+          <wp:inline distT="0" distB="0" distL="0" distR="0" wp14:anchorId="15A45230" wp14:editId="24CD6BD0">
+            <wp:extent cx="3957468" cy="1153886"/>
+            <wp:effectExtent l="0" t="0" r="5080" b="8255"/>
+            <wp:docPr id="1452460361" name="Graphic 13"/>
             <wp:cNvGraphicFramePr>
               <a:graphicFrameLocks xmlns:a="http://schemas.openxmlformats.org/drawingml/2006/main" noChangeAspect="1"/>
             </wp:cNvGraphicFramePr>
@@ -3122,7 +3079,7 @@
               <a:graphicData uri="http://schemas.openxmlformats.org/drawingml/2006/picture">
                 <pic:pic xmlns:pic="http://schemas.openxmlformats.org/drawingml/2006/picture">
                   <pic:nvPicPr>
-                    <pic:cNvPr id="1061379370" name="Graphic 1061379370"/>
+                    <pic:cNvPr id="1452460361" name="Graphic 1452460361"/>
                     <pic:cNvPicPr/>
                   </pic:nvPicPr>
                   <pic:blipFill>
@@ -3140,7 +3097,7 @@
                   <pic:spPr>
                     <a:xfrm>
                       <a:off x="0" y="0"/>
-                      <a:ext cx="5514975" cy="2247900"/>
+                      <a:ext cx="3957468" cy="1153886"/>
                     </a:xfrm>
                     <a:prstGeom prst="rect">
                       <a:avLst/>
@@ -3153,8 +3110,135 @@
         </w:drawing>
       </w:r>
     </w:p>
+    <w:p>
+      <w:pPr>
+        <w:pStyle w:val="Heading2"/>
+      </w:pPr>
+      <w:bookmarkStart w:id="16" w:name="_Toc221975573"/>
+      <w:r>
+        <w:t>3.7 Single-line comment</w:t>
+      </w:r>
+      <w:bookmarkEnd w:id="16"/>
+    </w:p>
+    <w:p>
+      <w:r>
+        <w:rPr>
+          <w:noProof/>
+        </w:rPr>
+        <w:drawing>
+          <wp:inline distT="0" distB="0" distL="0" distR="0" wp14:anchorId="73CE4788" wp14:editId="1E9AF537">
+            <wp:extent cx="4122420" cy="1680296"/>
+            <wp:effectExtent l="0" t="0" r="0" b="0"/>
+            <wp:docPr id="1061379370" name="Graphic 14"/>
+            <wp:cNvGraphicFramePr>
+              <a:graphicFrameLocks xmlns:a="http://schemas.openxmlformats.org/drawingml/2006/main" noChangeAspect="1"/>
+            </wp:cNvGraphicFramePr>
+            <a:graphic xmlns:a="http://schemas.openxmlformats.org/drawingml/2006/main">
+              <a:graphicData uri="http://schemas.openxmlformats.org/drawingml/2006/picture">
+                <pic:pic xmlns:pic="http://schemas.openxmlformats.org/drawingml/2006/picture">
+                  <pic:nvPicPr>
+                    <pic:cNvPr id="1061379370" name="Graphic 1061379370"/>
+                    <pic:cNvPicPr/>
+                  </pic:nvPicPr>
+                  <pic:blipFill>
+                    <a:blip r:embed="rId35">
+                      <a:extLst>
+                        <a:ext uri="{96DAC541-7B7A-43D3-8B79-37D633B846F1}">
+                          <asvg:svgBlip xmlns:asvg="http://schemas.microsoft.com/office/drawing/2016/SVG/main" r:embed="rId36"/>
+                        </a:ext>
+                      </a:extLst>
+                    </a:blip>
+                    <a:stretch>
+                      <a:fillRect/>
+                    </a:stretch>
+                  </pic:blipFill>
+                  <pic:spPr>
+                    <a:xfrm>
+                      <a:off x="0" y="0"/>
+                      <a:ext cx="4133255" cy="1684712"/>
+                    </a:xfrm>
+                    <a:prstGeom prst="rect">
+                      <a:avLst/>
+                    </a:prstGeom>
+                  </pic:spPr>
+                </pic:pic>
+              </a:graphicData>
+            </a:graphic>
+          </wp:inline>
+        </w:drawing>
+      </w:r>
+    </w:p>
+    <w:p>
+      <w:pPr>
+        <w:pStyle w:val="Heading2"/>
+      </w:pPr>
+      <w:r>
+        <w:t>3.8 Combined DFA</w:t>
+      </w:r>
+    </w:p>
+    <w:p/>
+    <w:p>
+      <w:r>
+        <w:lastRenderedPageBreak/>
+        <w:drawing>
+          <wp:anchor distT="0" distB="0" distL="114300" distR="114300" simplePos="0" relativeHeight="251661312" behindDoc="1" locked="0" layoutInCell="1" allowOverlap="1" wp14:anchorId="50450F6A" wp14:editId="5C4E3424">
+            <wp:simplePos x="0" y="0"/>
+            <wp:positionH relativeFrom="page">
+              <wp:align>left</wp:align>
+            </wp:positionH>
+            <wp:positionV relativeFrom="paragraph">
+              <wp:posOffset>-438150</wp:posOffset>
+            </wp:positionV>
+            <wp:extent cx="10662876" cy="7282543"/>
+            <wp:effectExtent l="0" t="0" r="5715" b="0"/>
+            <wp:wrapNone/>
+            <wp:docPr id="1062736276" name="Graphic 1"/>
+            <wp:cNvGraphicFramePr>
+              <a:graphicFrameLocks xmlns:a="http://schemas.openxmlformats.org/drawingml/2006/main" noChangeAspect="1"/>
+            </wp:cNvGraphicFramePr>
+            <a:graphic xmlns:a="http://schemas.openxmlformats.org/drawingml/2006/main">
+              <a:graphicData uri="http://schemas.openxmlformats.org/drawingml/2006/picture">
+                <pic:pic xmlns:pic="http://schemas.openxmlformats.org/drawingml/2006/picture">
+                  <pic:nvPicPr>
+                    <pic:cNvPr id="1062736276" name=""/>
+                    <pic:cNvPicPr/>
+                  </pic:nvPicPr>
+                  <pic:blipFill>
+                    <a:blip r:embed="rId37">
+                      <a:extLst>
+                        <a:ext uri="{96DAC541-7B7A-43D3-8B79-37D633B846F1}">
+                          <asvg:svgBlip xmlns:asvg="http://schemas.microsoft.com/office/drawing/2016/SVG/main" r:embed="rId38"/>
+                        </a:ext>
+                      </a:extLst>
+                    </a:blip>
+                    <a:stretch>
+                      <a:fillRect/>
+                    </a:stretch>
+                  </pic:blipFill>
+                  <pic:spPr>
+                    <a:xfrm>
+                      <a:off x="0" y="0"/>
+                      <a:ext cx="10662876" cy="7282543"/>
+                    </a:xfrm>
+                    <a:prstGeom prst="rect">
+                      <a:avLst/>
+                    </a:prstGeom>
+                  </pic:spPr>
+                </pic:pic>
+              </a:graphicData>
+            </a:graphic>
+            <wp14:sizeRelH relativeFrom="margin">
+              <wp14:pctWidth>0</wp14:pctWidth>
+            </wp14:sizeRelH>
+            <wp14:sizeRelV relativeFrom="margin">
+              <wp14:pctHeight>0</wp14:pctHeight>
+            </wp14:sizeRelV>
+          </wp:anchor>
+        </w:drawing>
+      </w:r>
+    </w:p>
     <w:sectPr>
-      <w:pgSz w:w="12240" w:h="15840"/>
+      <w:pgSz w:w="16838" w:h="11906" w:orient="landscape" w:code="9"/>
       <w:pgMar w:top="720" w:right="720" w:bottom="720" w:left="720" w:header="720" w:footer="720" w:gutter="0"/>
       <w:cols w:space="720"/>
       <w:docGrid w:linePitch="360"/>

</xml_diff>